<commit_message>
Documentation Update fro HDHomerun DVB_T/T2 Rx
</commit_message>
<xml_diff>
--- a/docs/lynx_install_guide.docx
+++ b/docs/lynx_install_guide.docx
@@ -37,7 +37,7 @@
           <w:b/>
           <w:bCs/>
         </w:rPr>
-        <w:t xml:space="preserve">Version 1.10  —  G8YTZ / EI3IOB  —  September 2026</w:t>
+        <w:t xml:space="preserve">Version 1.11  —  G8YTZ / EI3IOB  —  September 2026</w:t>
       </w:r>
     </w:p>
     <w:p>
@@ -511,7 +511,8 @@
         </w:rPr>
         <w:t xml:space="preserve">sudo apt install -y mpv python3-pip python3-gi python3-gi-cairo \
   gir1.2-gtk-4.0 gir1.2-gdkpixbuf-2.0 libgtk4-layer-shell0 \
-  gir1.2-gtk4layershell-1.0 ffmpeg curl socat librsvg2-bin git</w:t>
+  gir1.2-gtk4layershell-1.0 ffmpeg curl socat librsvg2-bin git \
+  hdhomerun-config</w:t>
       </w:r>
     </w:p>
     <w:tbl>
@@ -1237,6 +1238,56 @@
           </w:p>
         </w:tc>
       </w:tr>
+      <w:tr>
+        <w:tc>
+          <w:tcPr>
+            <w:tcW w:type="dxa" w:w="2400"/>
+          </w:tcPr>
+          <w:p>
+            <w:r>
+              <w:rPr>
+                <w:b w:val="false"/>
+                <w:bCs w:val="false"/>
+                <w:sz w:val="20"/>
+                <w:szCs w:val="20"/>
+              </w:rPr>
+              <w:t xml:space="preserve">hdhomerun-config</w:t>
+            </w:r>
+          </w:p>
+        </w:tc>
+        <w:tc>
+          <w:tcPr>
+            <w:tcW w:type="dxa" w:w="3200"/>
+          </w:tcPr>
+          <w:p>
+            <w:r>
+              <w:rPr>
+                <w:b w:val="false"/>
+                <w:bCs w:val="false"/>
+                <w:sz w:val="20"/>
+                <w:szCs w:val="20"/>
+              </w:rPr>
+              <w:t xml:space="preserve">HDHomeRun control tool</w:t>
+            </w:r>
+          </w:p>
+        </w:tc>
+        <w:tc>
+          <w:tcPr>
+            <w:tcW w:type="dxa" w:w="4200"/>
+          </w:tcPr>
+          <w:p>
+            <w:r>
+              <w:rPr>
+                <w:b w:val="false"/>
+                <w:bCs w:val="false"/>
+                <w:sz w:val="20"/>
+                <w:szCs w:val="20"/>
+              </w:rPr>
+              <w:t xml:space="preserve">SiliconDust’s own utility. Lynx talks to an HDHomeRun entirely through it — discovery, tuning and status. Only needed for DVB-T/T2/C reception, but harmless otherwise at 56 KB</w:t>
+            </w:r>
+          </w:p>
+        </w:tc>
+      </w:tr>
     </w:tbl>
     <w:p>
       <w:pPr>
@@ -2947,6 +2998,31 @@
       </w:pPr>
       <w:r>
         <w:t xml:space="preserve">Connect it to the same network as the Pi and power it on. There is nothing to configure: Lynx sweeps for one at startup and a tuner on the same subnet is found on its own. The DVB-T2 panel and tuning card appear in the Web Control Portal once it has been.</w:t>
+      </w:r>
+    </w:p>
+    <w:p>
+      <w:pPr>
+        <w:pBdr>
+          <w:left w:val="single" w:sz="12" w:space="8" w:color="E8A33D"/>
+        </w:pBdr>
+        <w:shd w:val="clear" w:color="auto" w:fill="FFF4E5"/>
+        <w:spacing w:before="100" w:after="200"/>
+        <w:ind w:left="200"/>
+      </w:pPr>
+      <w:r>
+        <w:rPr>
+          <w:i/>
+          <w:iCs/>
+        </w:rPr>
+        <w:t xml:space="preserve">The hdhomerun-config package must be installed — Lynx talks to the tuner entirely through SiliconDust’s own command-line tool, and without it discovery finds nothing and the log says so. The installer fits it automatically, including on an existing receiver via Update Now, but a hand-built system needs sudo apt install hdhomerun-config.</w:t>
+      </w:r>
+    </w:p>
+    <w:p>
+      <w:pPr>
+        <w:spacing w:after="150"/>
+      </w:pPr>
+      <w:r>
+        <w:t xml:space="preserve"/>
       </w:r>
     </w:p>
     <w:p>

</xml_diff>